<commit_message>
Add new semester labs and updated reports
</commit_message>
<xml_diff>
--- a/vp/2/ЛР2_отчёт.docx
+++ b/vp/2/ЛР2_отчёт.docx
@@ -85,7 +85,7 @@
       <w:r>
         <w:drawing>
           <wp:inline xmlns:a="http://schemas.openxmlformats.org/drawingml/2006/main" xmlns:pic="http://schemas.openxmlformats.org/drawingml/2006/picture">
-            <wp:extent cx="5580000" cy="1272632"/>
+            <wp:extent cx="5580000" cy="1068047"/>
             <wp:docPr id="1" name="Picture 1"/>
             <wp:cNvGraphicFramePr>
               <a:graphicFrameLocks noChangeAspect="1"/>
@@ -106,7 +106,7 @@
                   <pic:spPr>
                     <a:xfrm>
                       <a:off x="0" y="0"/>
-                      <a:ext cx="5580000" cy="1272632"/>
+                      <a:ext cx="5580000" cy="1068047"/>
                     </a:xfrm>
                     <a:prstGeom prst="rect"/>
                   </pic:spPr>
@@ -128,7 +128,7 @@
           <w:rFonts w:ascii="Times New Roman" w:hAnsi="Times New Roman"/>
           <w:sz w:val="24"/>
         </w:rPr>
-        <w:t>Рисунок 1. Работающие поды мониторинга</w:t>
+        <w:t>Рисунок 1. Просмотр сохранённого списка подов мониторинга</w:t>
       </w:r>
     </w:p>
     <w:p>
@@ -856,7 +856,7 @@
                 <w:rFonts w:ascii="Times New Roman" w:hAnsi="Times New Roman"/>
                 <w:sz w:val="20"/>
               </w:rPr>
-              <w:t>сек</w:t>
+              <w:t>запрос</w:t>
             </w:r>
           </w:p>
         </w:tc>
@@ -1798,7 +1798,7 @@
     </w:p>
     <w:p>
       <w:r>
-        <w:t>Ниже показаны настоящие снимки терминала. На них открыт сохранённый вывод именно этих трёх прогонов, а не запуск теста в момент снимка.</w:t>
+        <w:t>На снимках терминала показаны каталог запуска, команда чтения сохранённого вывода k6 и результаты трёх прогонов. Снимки сделаны после завершения тестов.</w:t>
       </w:r>
     </w:p>
     <w:p>
@@ -1810,7 +1810,7 @@
       <w:r>
         <w:drawing>
           <wp:inline xmlns:a="http://schemas.openxmlformats.org/drawingml/2006/main" xmlns:pic="http://schemas.openxmlformats.org/drawingml/2006/picture">
-            <wp:extent cx="5580000" cy="1272632"/>
+            <wp:extent cx="5580000" cy="1068047"/>
             <wp:docPr id="4" name="Picture 4"/>
             <wp:cNvGraphicFramePr>
               <a:graphicFrameLocks noChangeAspect="1"/>
@@ -1831,7 +1831,7 @@
                   <pic:spPr>
                     <a:xfrm>
                       <a:off x="0" y="0"/>
-                      <a:ext cx="5580000" cy="1272632"/>
+                      <a:ext cx="5580000" cy="1068047"/>
                     </a:xfrm>
                     <a:prstGeom prst="rect"/>
                   </pic:spPr>
@@ -1853,7 +1853,7 @@
           <w:rFonts w:ascii="Times New Roman" w:hAnsi="Times New Roman"/>
           <w:sz w:val="24"/>
         </w:rPr>
-        <w:t>Рисунок 4. Сохранённый вывод k6 для 10 VU</w:t>
+        <w:t>Рисунок 4. Просмотр сохранённого вывода k6 для 10 VU</w:t>
       </w:r>
     </w:p>
     <w:p>
@@ -1865,7 +1865,7 @@
       <w:r>
         <w:drawing>
           <wp:inline xmlns:a="http://schemas.openxmlformats.org/drawingml/2006/main" xmlns:pic="http://schemas.openxmlformats.org/drawingml/2006/picture">
-            <wp:extent cx="5580000" cy="1272632"/>
+            <wp:extent cx="5580000" cy="1068047"/>
             <wp:docPr id="5" name="Picture 5"/>
             <wp:cNvGraphicFramePr>
               <a:graphicFrameLocks noChangeAspect="1"/>
@@ -1886,7 +1886,7 @@
                   <pic:spPr>
                     <a:xfrm>
                       <a:off x="0" y="0"/>
-                      <a:ext cx="5580000" cy="1272632"/>
+                      <a:ext cx="5580000" cy="1068047"/>
                     </a:xfrm>
                     <a:prstGeom prst="rect"/>
                   </pic:spPr>
@@ -1908,7 +1908,7 @@
           <w:rFonts w:ascii="Times New Roman" w:hAnsi="Times New Roman"/>
           <w:sz w:val="24"/>
         </w:rPr>
-        <w:t>Рисунок 5. Сохранённый вывод k6 для 50 VU</w:t>
+        <w:t>Рисунок 5. Просмотр сохранённого вывода k6 для 50 VU</w:t>
       </w:r>
     </w:p>
     <w:p>
@@ -1920,7 +1920,7 @@
       <w:r>
         <w:drawing>
           <wp:inline xmlns:a="http://schemas.openxmlformats.org/drawingml/2006/main" xmlns:pic="http://schemas.openxmlformats.org/drawingml/2006/picture">
-            <wp:extent cx="5580000" cy="1272632"/>
+            <wp:extent cx="5580000" cy="1068047"/>
             <wp:docPr id="6" name="Picture 6"/>
             <wp:cNvGraphicFramePr>
               <a:graphicFrameLocks noChangeAspect="1"/>
@@ -1941,7 +1941,7 @@
                   <pic:spPr>
                     <a:xfrm>
                       <a:off x="0" y="0"/>
-                      <a:ext cx="5580000" cy="1272632"/>
+                      <a:ext cx="5580000" cy="1068047"/>
                     </a:xfrm>
                     <a:prstGeom prst="rect"/>
                   </pic:spPr>
@@ -1963,20 +1963,12 @@
           <w:rFonts w:ascii="Times New Roman" w:hAnsi="Times New Roman"/>
           <w:sz w:val="24"/>
         </w:rPr>
-        <w:t>Рисунок 6. Сохранённый вывод k6 для 200 VU</w:t>
-      </w:r>
-    </w:p>
-    <w:p>
-      <w:pPr>
-        <w:pStyle w:val="Heading1"/>
-      </w:pPr>
-      <w:r>
-        <w:t>4. Сравнение и анализ</w:t>
+        <w:t>Рисунок 6. Просмотр сохранённого вывода k6 для 200 VU</w:t>
       </w:r>
     </w:p>
     <w:p>
       <w:r>
-        <w:t>Для 200 VU k6 показал p95 = 228.16 мс, а Prometheus = 8.42 мс. Разница равна 219.73 мс, или 96.31 % от значения k6. k6 измеряет полный ответ клиенту. Метрика приложения измеряет только обработку внутри Flask. Кроме того, Prometheus оценивает квантиль по бакетам за окно 40 секунд, а k6 считает по ответам во время 30-секундного теста. Поэтому значения напрямую не совпадают.</w:t>
+        <w:t>Сохранённые ответы Prometheus на запрос sum(rate(http_requests_total{namespace="vp-lr2",route="index"}[15s])) содержат точки временного ряда во время каждого прогона. По ним построен график ниже. Это график по ответам Prometheus, а не снимок его веб-интерфейса: локальный кластер сейчас остановлен.</w:t>
       </w:r>
     </w:p>
     <w:p>
@@ -1997,7 +1989,7 @@
               <a:graphicData uri="http://schemas.openxmlformats.org/drawingml/2006/picture">
                 <pic:pic>
                   <pic:nvPicPr>
-                    <pic:cNvPr id="0" name="p95.png"/>
+                    <pic:cNvPr id="0" name="prometheus-rps-time.png"/>
                     <pic:cNvPicPr/>
                   </pic:nvPicPr>
                   <pic:blipFill>
@@ -2031,7 +2023,20 @@
           <w:rFonts w:ascii="Times New Roman" w:hAnsi="Times New Roman"/>
           <w:sz w:val="24"/>
         </w:rPr>
-        <w:t>Рисунок 7. Изменение p95 при росте нагрузки</w:t>
+        <w:t>Рисунок 7. Изменение RPS во времени по сохранённым ответам Prometheus</w:t>
+      </w:r>
+    </w:p>
+    <w:p>
+      <w:pPr>
+        <w:pStyle w:val="Heading1"/>
+      </w:pPr>
+      <w:r>
+        <w:t>4. Сравнение и анализ</w:t>
+      </w:r>
+    </w:p>
+    <w:p>
+      <w:r>
+        <w:t>Для 200 VU k6 показал p95 = 228.16 мс, а Prometheus = 8.42 мс. Разница равна 219.73 мс, или 96.31 % от значения k6. k6 измеряет полный ответ клиенту. Метрика приложения измеряет только обработку внутри Flask. Кроме того, Prometheus оценивает квантиль по бакетам за окно 40 секунд, а k6 считает по ответам во время 30-секундного теста. Поэтому значения напрямую не совпадают.</w:t>
       </w:r>
     </w:p>
     <w:p>
@@ -2052,7 +2057,7 @@
               <a:graphicData uri="http://schemas.openxmlformats.org/drawingml/2006/picture">
                 <pic:pic>
                   <pic:nvPicPr>
-                    <pic:cNvPr id="0" name="resources.png"/>
+                    <pic:cNvPr id="0" name="p95.png"/>
                     <pic:cNvPicPr/>
                   </pic:nvPicPr>
                   <pic:blipFill>
@@ -2086,7 +2091,7 @@
           <w:rFonts w:ascii="Times New Roman" w:hAnsi="Times New Roman"/>
           <w:sz w:val="24"/>
         </w:rPr>
-        <w:t>Рисунок 8. Средние CPU и память auth-service</w:t>
+        <w:t>Рисунок 8. Изменение p95 при росте нагрузки</w:t>
       </w:r>
     </w:p>
     <w:p>
@@ -2107,7 +2112,7 @@
               <a:graphicData uri="http://schemas.openxmlformats.org/drawingml/2006/picture">
                 <pic:pic>
                   <pic:nvPicPr>
-                    <pic:cNvPr id="0" name="rps.png"/>
+                    <pic:cNvPr id="0" name="resources.png"/>
                     <pic:cNvPicPr/>
                   </pic:nvPicPr>
                   <pic:blipFill>
@@ -2141,7 +2146,62 @@
           <w:rFonts w:ascii="Times New Roman" w:hAnsi="Times New Roman"/>
           <w:sz w:val="24"/>
         </w:rPr>
-        <w:t>Рисунок 9. Пропускная способность по данным k6</w:t>
+        <w:t>Рисунок 9. Средние CPU и память auth-service</w:t>
+      </w:r>
+    </w:p>
+    <w:p>
+      <w:pPr>
+        <w:spacing w:after="0"/>
+        <w:ind w:firstLine="0"/>
+        <w:jc w:val="center"/>
+      </w:pPr>
+      <w:r>
+        <w:drawing>
+          <wp:inline xmlns:a="http://schemas.openxmlformats.org/drawingml/2006/main" xmlns:pic="http://schemas.openxmlformats.org/drawingml/2006/picture">
+            <wp:extent cx="5580000" cy="3138750"/>
+            <wp:docPr id="10" name="Picture 10"/>
+            <wp:cNvGraphicFramePr>
+              <a:graphicFrameLocks noChangeAspect="1"/>
+            </wp:cNvGraphicFramePr>
+            <a:graphic>
+              <a:graphicData uri="http://schemas.openxmlformats.org/drawingml/2006/picture">
+                <pic:pic>
+                  <pic:nvPicPr>
+                    <pic:cNvPr id="0" name="rps.png"/>
+                    <pic:cNvPicPr/>
+                  </pic:nvPicPr>
+                  <pic:blipFill>
+                    <a:blip r:embed="rId18"/>
+                    <a:stretch>
+                      <a:fillRect/>
+                    </a:stretch>
+                  </pic:blipFill>
+                  <pic:spPr>
+                    <a:xfrm>
+                      <a:off x="0" y="0"/>
+                      <a:ext cx="5580000" cy="3138750"/>
+                    </a:xfrm>
+                    <a:prstGeom prst="rect"/>
+                  </pic:spPr>
+                </pic:pic>
+              </a:graphicData>
+            </a:graphic>
+          </wp:inline>
+        </w:drawing>
+      </w:r>
+    </w:p>
+    <w:p>
+      <w:pPr>
+        <w:spacing w:line="240" w:lineRule="auto" w:before="40" w:after="160"/>
+        <w:ind w:firstLine="0"/>
+        <w:jc w:val="center"/>
+      </w:pPr>
+      <w:r>
+        <w:rPr>
+          <w:rFonts w:ascii="Times New Roman" w:hAnsi="Times New Roman"/>
+          <w:sz w:val="24"/>
+        </w:rPr>
+        <w:t>Рисунок 10. Пропускная способность по данным k6</w:t>
       </w:r>
     </w:p>
     <w:p>
@@ -2226,7 +2286,7 @@
       </w:r>
     </w:p>
     <w:sectPr>
-      <w:footerReference w:type="default" r:id="rId18"/>
+      <w:footerReference w:type="default" r:id="rId19"/>
       <w:pgSz w:w="11906" w:h="16838"/>
       <w:pgMar w:top="1134" w:right="850" w:bottom="737" w:left="1701" w:header="720" w:footer="720" w:gutter="0"/>
       <w:cols w:space="720"/>

</xml_diff>